<commit_message>
Update conference Word document equations and add Early-Life Offset vs End-of-Life Convergence
</commit_message>
<xml_diff>
--- a/Dynamic_RUL_Prediction_Conference_Documentation.docx
+++ b/Dynamic_RUL_Prediction_Conference_Documentation.docx
@@ -542,7 +542,7 @@
           <w:b/>
           <w:sz w:val="24"/>
         </w:rPr>
-        <w:t>H(s) = V(s) / I(s) = R_0 + R_1 / (1 + R_1 C_1 s) = R_0 * (s + z_1) / (s + p_1)</w:t>
+        <w:t>H(s) = V(s) / I(s)  =  R₀  +  [ R₁ / (1 + R₁ C₁ s) ]  =  R₀ · (s + z₁) / (s + p₁)</w:t>
         <w:br/>
       </w:r>
     </w:p>
@@ -576,7 +576,7 @@
         <w:t xml:space="preserve">Electrochemical Time Constant (τ): </w:t>
       </w:r>
       <w:r>
-        <w:t>Calculated as τ = R_1 * C_1. This represents the chemical reaction delay in seconds required for active ions to reach equilibrium after a current pulse.</w:t>
+        <w:t>Calculated as τ = R₁ · C₁. This represents the chemical reaction delay in seconds required for active ions to reach equilibrium after a current pulse.</w:t>
       </w:r>
     </w:p>
     <w:p>
@@ -587,10 +587,10 @@
         <w:rPr>
           <w:b/>
         </w:rPr>
-        <w:t xml:space="preserve">System Pole (sp): </w:t>
+        <w:t xml:space="preserve">System Pole (sₚ): </w:t>
       </w:r>
       <w:r>
-        <w:t>Derived by setting the transfer function denominator to zero: sp = -1 / τ = -1 / (R_1 * C_1). The pole dictates system stability and settling speed.</w:t>
+        <w:t>Derived by setting the transfer function denominator to zero: sₚ = -1 / τ = -1 / (R₁ · C₁). The pole dictates system stability and settling speed.</w:t>
       </w:r>
     </w:p>
     <w:p>
@@ -601,10 +601,10 @@
         <w:rPr>
           <w:b/>
         </w:rPr>
-        <w:t xml:space="preserve">System Zero (sz): </w:t>
+        <w:t xml:space="preserve">System Zero (s𝓏): </w:t>
       </w:r>
       <w:r>
-        <w:t>Derived by setting the numerator to zero: sz = -(R_0 + R_1) / (R_0 * R_1 * C_1). Notice that (R_0 * R_1) / (R_0 + R_1) is the exact formula for parallel resistors (R_parallel). Thus, sz = -1 / (R_parallel * C_1). The zero governs immediate voltage sag during sudden acceleration.</w:t>
+        <w:t>Derived by setting the numerator to zero: s𝓏 = -(R₀ + R₁) / (R₀ · R₁ · C₁). Notice that (R₀ · R₁) / (R₀ + R₁) is the exact formula for parallel resistors (R_parallel). Thus, s𝓏 = -1 / (R_parallel · C₁). The zero governs immediate voltage sag during sudden acceleration.</w:t>
       </w:r>
     </w:p>
     <w:p>
@@ -1171,6 +1171,20 @@
         <w:rPr>
           <w:b/>
         </w:rPr>
+        <w:t xml:space="preserve">Lifespan Horizon &amp; Early-Life Offset vs. End-of-Life Convergence: </w:t>
+      </w:r>
+      <w:r>
+        <w:t>The Stanford/MIT dataset batteries underwent continuous multistep fast-charging profiles (1C to 6C rates), causing them to reach their 80% SOH end-of-life retirement horizon in approximately 1,000 to 1,200 cycles (matching standard Indian market EV passenger and taxi fleets). However, ultra-gentle 'eco-mode' slow charging (e.g., home charging at 0.2C) extends LFP lifespans up to 2,000–3,500 cycles. When evaluating external data exceeding 2,000 cycles, the model exhibits early-life horizon offset (predicting shorter RUL during early healthy cycles due to fast-charge training weights). Crucially, however, as the battery approaches true end-of-life and internal resistance (IR) spikes, the physical degradation signature overrides cycle counting, causing the model predictions to converge flawlessly onto the true RUL failure horizon. Future research will incorporate multi-horizon transfer learning across both gentle and aggressive charging cohorts.</w:t>
+      </w:r>
+    </w:p>
+    <w:p>
+      <w:pPr>
+        <w:pStyle w:val="ListBullet"/>
+      </w:pPr>
+      <w:r>
+        <w:rPr>
+          <w:b/>
+        </w:rPr>
         <w:t xml:space="preserve">Extreme Thermal Shock: </w:t>
       </w:r>
       <w:r>

</xml_diff>